<commit_message>
feat: optimasi iPhone/mobile, fitur buka blokir dan reset ujian siswa, dan import Word dengan gambar soal dan opsi serta kompresi otomatis
</commit_message>
<xml_diff>
--- a/public/Template_Bank_Soal_Nineteen_Exam.docx
+++ b/public/Template_Bank_Soal_Nineteen_Exam.docx
@@ -63,6 +63,16 @@
     <w:p>
       <w:r>
         <w:t xml:space="preserve">9. Untuk Drag and Drop (Mengurutkan), tuliskan urutan yang benar dari atas ke bawah (A, B, C, D) di opsi jawaban.</w:t>
+      </w:r>
+    </w:p>
+    <w:p>
+      <w:r>
+        <w:t xml:space="preserve">10. Gambar pada Soal &amp; Opsi Jawaban: Cukup paste/sisipkan gambar langsung di Word pada teks soal maupun pada opsi jawaban (A, B, C, D, E). Sistem secara otomatis membaca dan mengompresi gambar menjadi format WebP ultra-ringan.</w:t>
+      </w:r>
+    </w:p>
+    <w:p>
+      <w:r>
+        <w:t xml:space="preserve">11. Anda juga dapat menggunakan baris 'Gambar:' untuk meletakkan gambar khusus soal.</w:t>
       </w:r>
     </w:p>
     <w:p/>

</xml_diff>